<commit_message>
Remove stale Sonic 4 references left by the TTS budget correction
Three documents still carried the withdrawn ~40ms vendor figure and the
superseded 660ms total. Aligned to the measured numbers.

Co-Authored-By: Claude Opus 5 <noreply@anthropic.com>
</commit_message>
<xml_diff>
--- a/docs/voice-platform/00-index.docx
+++ b/docs/voice-platform/00-index.docx
@@ -2178,7 +2178,7 @@
                 <w:rFonts w:ascii="Nirmala UI" w:hAnsi="Nirmala UI" w:eastAsia="Nirmala UI" w:cs="Nirmala UI"/>
                 <w:sz w:val="18"/>
               </w:rPr>
-              <w:t>150 ms</w:t>
+              <w:t>190 ms</w:t>
             </w:r>
           </w:p>
         </w:tc>
@@ -2195,7 +2195,7 @@
                 <w:rFonts w:ascii="Nirmala UI" w:hAnsi="Nirmala UI" w:eastAsia="Nirmala UI" w:cs="Nirmala UI"/>
                 <w:sz w:val="18"/>
               </w:rPr>
-              <w:t>60 ms</w:t>
+              <w:t>190 ms</w:t>
             </w:r>
           </w:p>
         </w:tc>
@@ -2210,9 +2210,17 @@
             <w:r>
               <w:rPr>
                 <w:rFonts w:ascii="Nirmala UI" w:hAnsi="Nirmala UI" w:eastAsia="Nirmala UI" w:cs="Nirmala UI"/>
+                <w:b/>
                 <w:sz w:val="18"/>
               </w:rPr>
-              <w:t>Cartesia Sonic 4</w:t>
+              <w:t>No saving available</w:t>
+            </w:r>
+            <w:r>
+              <w:rPr>
+                <w:rFonts w:ascii="Nirmala UI" w:hAnsi="Nirmala UI" w:eastAsia="Nirmala UI" w:cs="Nirmala UI"/>
+                <w:sz w:val="18"/>
+              </w:rPr>
+              <w:t xml:space="preserve"> — measured floor is ~155 ms</w:t>
             </w:r>
           </w:p>
         </w:tc>
@@ -2320,7 +2328,7 @@
                 <w:b/>
                 <w:sz w:val="18"/>
               </w:rPr>
-              <w:t>1,950 ms</w:t>
+              <w:t>1,990 ms</w:t>
             </w:r>
           </w:p>
         </w:tc>
@@ -2338,7 +2346,7 @@
                 <w:b/>
                 <w:sz w:val="18"/>
               </w:rPr>
-              <w:t>660 ms</w:t>
+              <w:t>790 ms</w:t>
             </w:r>
           </w:p>
         </w:tc>
@@ -2350,6 +2358,13 @@
             <w:pPr>
               <w:spacing w:before="40" w:after="40"/>
             </w:pPr>
+            <w:r>
+              <w:rPr>
+                <w:rFonts w:ascii="Nirmala UI" w:hAnsi="Nirmala UI" w:eastAsia="Nirmala UI" w:cs="Nirmala UI"/>
+                <w:sz w:val="18"/>
+              </w:rPr>
+              <w:t>Only 10 ms under target</w:t>
+            </w:r>
           </w:p>
         </w:tc>
       </w:tr>
@@ -2455,7 +2470,7 @@
                 <w:rFonts w:ascii="Nirmala UI" w:hAnsi="Nirmala UI" w:eastAsia="Nirmala UI" w:cs="Nirmala UI"/>
                 <w:sz w:val="18"/>
               </w:rPr>
-              <w:t>~2,440 ms</w:t>
+              <w:t>~2,480 ms</w:t>
             </w:r>
           </w:p>
         </w:tc>
@@ -2473,7 +2488,7 @@
                 <w:b/>
                 <w:sz w:val="18"/>
               </w:rPr>
-              <w:t>~1,150 ms</w:t>
+              <w:t>~1,280 ms</w:t>
             </w:r>
           </w:p>
         </w:tc>

</xml_diff>

<commit_message>
Record the handover health check and the loan-agent regression
Co-Authored-By: Claude Opus 5 (1M context) <noreply@anthropic.com>
</commit_message>
<xml_diff>
--- a/docs/voice-platform/00-index.docx
+++ b/docs/voice-platform/00-index.docx
@@ -816,6 +816,707 @@
                 <w:sz w:val="18"/>
               </w:rPr>
               <w:t>L-G1…L-G6</w:t>
+            </w:r>
+          </w:p>
+        </w:tc>
+      </w:tr>
+    </w:tbl>
+    <w:p/>
+    <w:p>
+      <w:pPr>
+        <w:pStyle w:val="Heading2"/>
+      </w:pPr>
+      <w:r>
+        <w:rPr>
+          <w:rFonts w:ascii="Nirmala UI" w:hAnsi="Nirmala UI" w:eastAsia="Nirmala UI" w:cs="Nirmala UI"/>
+          <w:color w:val="1F4E79"/>
+        </w:rPr>
+        <w:t>Build reports</w:t>
+      </w:r>
+    </w:p>
+    <w:p>
+      <w:pPr>
+        <w:spacing w:after="120"/>
+      </w:pPr>
+      <w:r>
+        <w:rPr>
+          <w:rFonts w:ascii="Nirmala UI" w:hAnsi="Nirmala UI" w:eastAsia="Nirmala UI" w:cs="Nirmala UI"/>
+        </w:rPr>
+        <w:t>Documents 1–9 are the plan. These record what was actually built, what broke,</w:t>
+      </w:r>
+    </w:p>
+    <w:p>
+      <w:pPr>
+        <w:spacing w:after="120"/>
+      </w:pPr>
+      <w:r>
+        <w:rPr>
+          <w:rFonts w:ascii="Nirmala UI" w:hAnsi="Nirmala UI" w:eastAsia="Nirmala UI" w:cs="Nirmala UI"/>
+        </w:rPr>
+        <w:t>and what the measurements said — written after the work, against real call logs.</w:t>
+      </w:r>
+    </w:p>
+    <w:tbl>
+      <w:tblPr>
+        <w:tblStyle w:val="TableGrid"/>
+        <w:tblW w:type="auto" w:w="0"/>
+        <w:jc w:val="center"/>
+        <w:tblLook w:firstColumn="1" w:firstRow="1" w:lastColumn="0" w:lastRow="0" w:noHBand="0" w:noVBand="1" w:val="04A0"/>
+      </w:tblPr>
+      <w:tblGrid>
+        <w:gridCol w:w="2880"/>
+        <w:gridCol w:w="2880"/>
+        <w:gridCol w:w="2880"/>
+      </w:tblGrid>
+      <w:tr>
+        <w:tc>
+          <w:tcPr>
+            <w:tcW w:type="dxa" w:w="2880"/>
+            <w:shd w:val="clear" w:color="auto" w:fill="DCE6F1"/>
+          </w:tcPr>
+          <w:p>
+            <w:pPr>
+              <w:spacing w:before="40" w:after="40"/>
+            </w:pPr>
+            <w:r>
+              <w:rPr>
+                <w:rFonts w:ascii="Nirmala UI" w:hAnsi="Nirmala UI" w:eastAsia="Nirmala UI" w:cs="Nirmala UI"/>
+                <w:b/>
+                <w:sz w:val="18"/>
+              </w:rPr>
+              <w:t>#</w:t>
+            </w:r>
+          </w:p>
+        </w:tc>
+        <w:tc>
+          <w:tcPr>
+            <w:tcW w:type="dxa" w:w="2880"/>
+            <w:shd w:val="clear" w:color="auto" w:fill="DCE6F1"/>
+          </w:tcPr>
+          <w:p>
+            <w:pPr>
+              <w:spacing w:before="40" w:after="40"/>
+            </w:pPr>
+            <w:r>
+              <w:rPr>
+                <w:rFonts w:ascii="Nirmala UI" w:hAnsi="Nirmala UI" w:eastAsia="Nirmala UI" w:cs="Nirmala UI"/>
+                <w:b/>
+                <w:sz w:val="18"/>
+              </w:rPr>
+              <w:t>Document</w:t>
+            </w:r>
+          </w:p>
+        </w:tc>
+        <w:tc>
+          <w:tcPr>
+            <w:tcW w:type="dxa" w:w="2880"/>
+            <w:shd w:val="clear" w:color="auto" w:fill="DCE6F1"/>
+          </w:tcPr>
+          <w:p>
+            <w:pPr>
+              <w:spacing w:before="40" w:after="40"/>
+            </w:pPr>
+            <w:r>
+              <w:rPr>
+                <w:rFonts w:ascii="Nirmala UI" w:hAnsi="Nirmala UI" w:eastAsia="Nirmala UI" w:cs="Nirmala UI"/>
+                <w:b/>
+                <w:sz w:val="18"/>
+              </w:rPr>
+              <w:t>What it answers</w:t>
+            </w:r>
+          </w:p>
+        </w:tc>
+      </w:tr>
+      <w:tr>
+        <w:tc>
+          <w:tcPr>
+            <w:tcW w:type="dxa" w:w="2880"/>
+          </w:tcPr>
+          <w:p>
+            <w:pPr>
+              <w:spacing w:before="40" w:after="40"/>
+            </w:pPr>
+            <w:r>
+              <w:rPr>
+                <w:rFonts w:ascii="Nirmala UI" w:hAnsi="Nirmala UI" w:eastAsia="Nirmala UI" w:cs="Nirmala UI"/>
+                <w:sz w:val="18"/>
+              </w:rPr>
+              <w:t>10</w:t>
+            </w:r>
+          </w:p>
+        </w:tc>
+        <w:tc>
+          <w:tcPr>
+            <w:tcW w:type="dxa" w:w="2880"/>
+          </w:tcPr>
+          <w:p>
+            <w:pPr>
+              <w:spacing w:before="40" w:after="40"/>
+            </w:pPr>
+            <w:r>
+              <w:rPr>
+                <w:rFonts w:ascii="Nirmala UI" w:hAnsi="Nirmala UI" w:eastAsia="Nirmala UI" w:cs="Nirmala UI"/>
+                <w:sz w:val="18"/>
+              </w:rPr>
+              <w:t>Dograh vs Vaani Architecture</w:t>
+            </w:r>
+          </w:p>
+        </w:tc>
+        <w:tc>
+          <w:tcPr>
+            <w:tcW w:type="dxa" w:w="2880"/>
+          </w:tcPr>
+          <w:p>
+            <w:pPr>
+              <w:spacing w:before="40" w:after="40"/>
+            </w:pPr>
+            <w:r>
+              <w:rPr>
+                <w:rFonts w:ascii="Nirmala UI" w:hAnsi="Nirmala UI" w:eastAsia="Nirmala UI" w:cs="Nirmala UI"/>
+                <w:i/>
+                <w:sz w:val="18"/>
+              </w:rPr>
+              <w:t>What did the open-source base give us, and what did Vaani add?</w:t>
+            </w:r>
+          </w:p>
+        </w:tc>
+      </w:tr>
+      <w:tr>
+        <w:tc>
+          <w:tcPr>
+            <w:tcW w:type="dxa" w:w="2880"/>
+          </w:tcPr>
+          <w:p>
+            <w:pPr>
+              <w:spacing w:before="40" w:after="40"/>
+            </w:pPr>
+            <w:r>
+              <w:rPr>
+                <w:rFonts w:ascii="Nirmala UI" w:hAnsi="Nirmala UI" w:eastAsia="Nirmala UI" w:cs="Nirmala UI"/>
+                <w:sz w:val="18"/>
+              </w:rPr>
+              <w:t>11</w:t>
+            </w:r>
+          </w:p>
+        </w:tc>
+        <w:tc>
+          <w:tcPr>
+            <w:tcW w:type="dxa" w:w="2880"/>
+          </w:tcPr>
+          <w:p>
+            <w:pPr>
+              <w:spacing w:before="40" w:after="40"/>
+            </w:pPr>
+            <w:r>
+              <w:rPr>
+                <w:rFonts w:ascii="Nirmala UI" w:hAnsi="Nirmala UI" w:eastAsia="Nirmala UI" w:cs="Nirmala UI"/>
+                <w:sz w:val="18"/>
+              </w:rPr>
+              <w:t>Engineering Report, 27 Aug</w:t>
+            </w:r>
+          </w:p>
+        </w:tc>
+        <w:tc>
+          <w:tcPr>
+            <w:tcW w:type="dxa" w:w="2880"/>
+          </w:tcPr>
+          <w:p>
+            <w:pPr>
+              <w:spacing w:before="40" w:after="40"/>
+            </w:pPr>
+            <w:r>
+              <w:rPr>
+                <w:rFonts w:ascii="Nirmala UI" w:hAnsi="Nirmala UI" w:eastAsia="Nirmala UI" w:cs="Nirmala UI"/>
+                <w:i/>
+                <w:sz w:val="18"/>
+              </w:rPr>
+              <w:t>The prompt, guardrail and turn-detector work</w:t>
+            </w:r>
+          </w:p>
+        </w:tc>
+      </w:tr>
+      <w:tr>
+        <w:tc>
+          <w:tcPr>
+            <w:tcW w:type="dxa" w:w="2880"/>
+          </w:tcPr>
+          <w:p>
+            <w:pPr>
+              <w:spacing w:before="40" w:after="40"/>
+            </w:pPr>
+            <w:r>
+              <w:rPr>
+                <w:rFonts w:ascii="Nirmala UI" w:hAnsi="Nirmala UI" w:eastAsia="Nirmala UI" w:cs="Nirmala UI"/>
+                <w:sz w:val="18"/>
+              </w:rPr>
+              <w:t>12</w:t>
+            </w:r>
+          </w:p>
+        </w:tc>
+        <w:tc>
+          <w:tcPr>
+            <w:tcW w:type="dxa" w:w="2880"/>
+          </w:tcPr>
+          <w:p>
+            <w:pPr>
+              <w:spacing w:before="40" w:after="40"/>
+            </w:pPr>
+            <w:r>
+              <w:rPr>
+                <w:rFonts w:ascii="Nirmala UI" w:hAnsi="Nirmala UI" w:eastAsia="Nirmala UI" w:cs="Nirmala UI"/>
+                <w:sz w:val="18"/>
+              </w:rPr>
+              <w:t>Engineering Report, 28 Aug</w:t>
+            </w:r>
+          </w:p>
+        </w:tc>
+        <w:tc>
+          <w:tcPr>
+            <w:tcW w:type="dxa" w:w="2880"/>
+          </w:tcPr>
+          <w:p>
+            <w:pPr>
+              <w:spacing w:before="40" w:after="40"/>
+            </w:pPr>
+            <w:r>
+              <w:rPr>
+                <w:rFonts w:ascii="Nirmala UI" w:hAnsi="Nirmala UI" w:eastAsia="Nirmala UI" w:cs="Nirmala UI"/>
+                <w:i/>
+                <w:sz w:val="18"/>
+              </w:rPr>
+              <w:t>Repeated questions, ignored questions, fillers, booking, the boosted detector</w:t>
+            </w:r>
+          </w:p>
+        </w:tc>
+      </w:tr>
+      <w:tr>
+        <w:tc>
+          <w:tcPr>
+            <w:tcW w:type="dxa" w:w="2880"/>
+          </w:tcPr>
+          <w:p>
+            <w:pPr>
+              <w:spacing w:before="40" w:after="40"/>
+            </w:pPr>
+            <w:r>
+              <w:rPr>
+                <w:rFonts w:ascii="Nirmala UI" w:hAnsi="Nirmala UI" w:eastAsia="Nirmala UI" w:cs="Nirmala UI"/>
+                <w:sz w:val="18"/>
+              </w:rPr>
+              <w:t>13</w:t>
+            </w:r>
+          </w:p>
+        </w:tc>
+        <w:tc>
+          <w:tcPr>
+            <w:tcW w:type="dxa" w:w="2880"/>
+          </w:tcPr>
+          <w:p>
+            <w:pPr>
+              <w:spacing w:before="40" w:after="40"/>
+            </w:pPr>
+            <w:r>
+              <w:rPr>
+                <w:rFonts w:ascii="Nirmala UI" w:hAnsi="Nirmala UI" w:eastAsia="Nirmala UI" w:cs="Nirmala UI"/>
+                <w:sz w:val="18"/>
+              </w:rPr>
+              <w:t>Engineering Report, 29 Aug</w:t>
+            </w:r>
+          </w:p>
+        </w:tc>
+        <w:tc>
+          <w:tcPr>
+            <w:tcW w:type="dxa" w:w="2880"/>
+          </w:tcPr>
+          <w:p>
+            <w:pPr>
+              <w:spacing w:before="40" w:after="40"/>
+            </w:pPr>
+            <w:r>
+              <w:rPr>
+                <w:rFonts w:ascii="Nirmala UI" w:hAnsi="Nirmala UI" w:eastAsia="Nirmala UI" w:cs="Nirmala UI"/>
+                <w:i/>
+                <w:sz w:val="18"/>
+              </w:rPr>
+              <w:t>Two-sided endpointing: why the agent talked over the caller, and the 1,393-clip measurement</w:t>
+            </w:r>
+          </w:p>
+        </w:tc>
+      </w:tr>
+      <w:tr>
+        <w:tc>
+          <w:tcPr>
+            <w:tcW w:type="dxa" w:w="2880"/>
+          </w:tcPr>
+          <w:p>
+            <w:pPr>
+              <w:spacing w:before="40" w:after="40"/>
+            </w:pPr>
+            <w:r>
+              <w:rPr>
+                <w:rFonts w:ascii="Nirmala UI" w:hAnsi="Nirmala UI" w:eastAsia="Nirmala UI" w:cs="Nirmala UI"/>
+                <w:sz w:val="18"/>
+              </w:rPr>
+              <w:t>14</w:t>
+            </w:r>
+          </w:p>
+        </w:tc>
+        <w:tc>
+          <w:tcPr>
+            <w:tcW w:type="dxa" w:w="2880"/>
+          </w:tcPr>
+          <w:p>
+            <w:pPr>
+              <w:spacing w:before="40" w:after="40"/>
+            </w:pPr>
+            <w:r>
+              <w:rPr>
+                <w:rFonts w:ascii="Nirmala UI" w:hAnsi="Nirmala UI" w:eastAsia="Nirmala UI" w:cs="Nirmala UI"/>
+                <w:sz w:val="18"/>
+              </w:rPr>
+              <w:t>Telugu Voice Register Guide</w:t>
+            </w:r>
+          </w:p>
+        </w:tc>
+        <w:tc>
+          <w:tcPr>
+            <w:tcW w:type="dxa" w:w="2880"/>
+          </w:tcPr>
+          <w:p>
+            <w:pPr>
+              <w:spacing w:before="40" w:after="40"/>
+            </w:pPr>
+            <w:r>
+              <w:rPr>
+                <w:rFonts w:ascii="Nirmala UI" w:hAnsi="Nirmala UI" w:eastAsia="Nirmala UI" w:cs="Nirmala UI"/>
+                <w:i/>
+                <w:sz w:val="18"/>
+              </w:rPr>
+              <w:t>How the agent should actually sound to a Telugu caller</w:t>
+            </w:r>
+          </w:p>
+        </w:tc>
+      </w:tr>
+      <w:tr>
+        <w:tc>
+          <w:tcPr>
+            <w:tcW w:type="dxa" w:w="2880"/>
+          </w:tcPr>
+          <w:p>
+            <w:pPr>
+              <w:spacing w:before="40" w:after="40"/>
+            </w:pPr>
+            <w:r>
+              <w:rPr>
+                <w:rFonts w:ascii="Nirmala UI" w:hAnsi="Nirmala UI" w:eastAsia="Nirmala UI" w:cs="Nirmala UI"/>
+                <w:sz w:val="18"/>
+              </w:rPr>
+              <w:t>15</w:t>
+            </w:r>
+          </w:p>
+        </w:tc>
+        <w:tc>
+          <w:tcPr>
+            <w:tcW w:type="dxa" w:w="2880"/>
+          </w:tcPr>
+          <w:p>
+            <w:pPr>
+              <w:spacing w:before="40" w:after="40"/>
+            </w:pPr>
+            <w:r>
+              <w:rPr>
+                <w:rFonts w:ascii="Nirmala UI" w:hAnsi="Nirmala UI" w:eastAsia="Nirmala UI" w:cs="Nirmala UI"/>
+                <w:sz w:val="18"/>
+              </w:rPr>
+              <w:t>Engineering Report, 30 Aug</w:t>
+            </w:r>
+          </w:p>
+        </w:tc>
+        <w:tc>
+          <w:tcPr>
+            <w:tcW w:type="dxa" w:w="2880"/>
+          </w:tcPr>
+          <w:p>
+            <w:pPr>
+              <w:spacing w:before="40" w:after="40"/>
+            </w:pPr>
+            <w:r>
+              <w:rPr>
+                <w:rFonts w:ascii="Nirmala UI" w:hAnsi="Nirmala UI" w:eastAsia="Nirmala UI" w:cs="Nirmala UI"/>
+                <w:i/>
+                <w:sz w:val="18"/>
+              </w:rPr>
+              <w:t>The four BS Wealth agents, built on the shared layers</w:t>
+            </w:r>
+          </w:p>
+        </w:tc>
+      </w:tr>
+      <w:tr>
+        <w:tc>
+          <w:tcPr>
+            <w:tcW w:type="dxa" w:w="2880"/>
+          </w:tcPr>
+          <w:p>
+            <w:pPr>
+              <w:spacing w:before="40" w:after="40"/>
+            </w:pPr>
+            <w:r>
+              <w:rPr>
+                <w:rFonts w:ascii="Nirmala UI" w:hAnsi="Nirmala UI" w:eastAsia="Nirmala UI" w:cs="Nirmala UI"/>
+                <w:sz w:val="18"/>
+              </w:rPr>
+              <w:t>16</w:t>
+            </w:r>
+          </w:p>
+        </w:tc>
+        <w:tc>
+          <w:tcPr>
+            <w:tcW w:type="dxa" w:w="2880"/>
+          </w:tcPr>
+          <w:p>
+            <w:pPr>
+              <w:spacing w:before="40" w:after="40"/>
+            </w:pPr>
+            <w:r>
+              <w:rPr>
+                <w:rFonts w:ascii="Nirmala UI" w:hAnsi="Nirmala UI" w:eastAsia="Nirmala UI" w:cs="Nirmala UI"/>
+                <w:sz w:val="18"/>
+              </w:rPr>
+              <w:t>Booking Defects, 30 Aug</w:t>
+            </w:r>
+          </w:p>
+        </w:tc>
+        <w:tc>
+          <w:tcPr>
+            <w:tcW w:type="dxa" w:w="2880"/>
+          </w:tcPr>
+          <w:p>
+            <w:pPr>
+              <w:spacing w:before="40" w:after="40"/>
+            </w:pPr>
+            <w:r>
+              <w:rPr>
+                <w:rFonts w:ascii="Nirmala UI" w:hAnsi="Nirmala UI" w:eastAsia="Nirmala UI" w:cs="Nirmala UI"/>
+                <w:i/>
+                <w:sz w:val="18"/>
+              </w:rPr>
+              <w:t>What broke in the appointment flow, and what fixed it</w:t>
+            </w:r>
+          </w:p>
+        </w:tc>
+      </w:tr>
+      <w:tr>
+        <w:tc>
+          <w:tcPr>
+            <w:tcW w:type="dxa" w:w="2880"/>
+          </w:tcPr>
+          <w:p>
+            <w:pPr>
+              <w:spacing w:before="40" w:after="40"/>
+            </w:pPr>
+            <w:r>
+              <w:rPr>
+                <w:rFonts w:ascii="Nirmala UI" w:hAnsi="Nirmala UI" w:eastAsia="Nirmala UI" w:cs="Nirmala UI"/>
+                <w:sz w:val="18"/>
+              </w:rPr>
+              <w:t>17</w:t>
+            </w:r>
+          </w:p>
+        </w:tc>
+        <w:tc>
+          <w:tcPr>
+            <w:tcW w:type="dxa" w:w="2880"/>
+          </w:tcPr>
+          <w:p>
+            <w:pPr>
+              <w:spacing w:before="40" w:after="40"/>
+            </w:pPr>
+            <w:r>
+              <w:rPr>
+                <w:rFonts w:ascii="Nirmala UI" w:hAnsi="Nirmala UI" w:eastAsia="Nirmala UI" w:cs="Nirmala UI"/>
+                <w:sz w:val="18"/>
+              </w:rPr>
+              <w:t>Listening Report, 30 Aug</w:t>
+            </w:r>
+          </w:p>
+        </w:tc>
+        <w:tc>
+          <w:tcPr>
+            <w:tcW w:type="dxa" w:w="2880"/>
+          </w:tcPr>
+          <w:p>
+            <w:pPr>
+              <w:spacing w:before="40" w:after="40"/>
+            </w:pPr>
+            <w:r>
+              <w:rPr>
+                <w:rFonts w:ascii="Nirmala UI" w:hAnsi="Nirmala UI" w:eastAsia="Nirmala UI" w:cs="Nirmala UI"/>
+                <w:i/>
+                <w:sz w:val="18"/>
+              </w:rPr>
+              <w:t>What the recordings say the agent is still getting wrong</w:t>
+            </w:r>
+          </w:p>
+        </w:tc>
+      </w:tr>
+      <w:tr>
+        <w:tc>
+          <w:tcPr>
+            <w:tcW w:type="dxa" w:w="2880"/>
+          </w:tcPr>
+          <w:p>
+            <w:pPr>
+              <w:spacing w:before="40" w:after="40"/>
+            </w:pPr>
+            <w:r>
+              <w:rPr>
+                <w:rFonts w:ascii="Nirmala UI" w:hAnsi="Nirmala UI" w:eastAsia="Nirmala UI" w:cs="Nirmala UI"/>
+                <w:sz w:val="18"/>
+              </w:rPr>
+              <w:t>18</w:t>
+            </w:r>
+          </w:p>
+        </w:tc>
+        <w:tc>
+          <w:tcPr>
+            <w:tcW w:type="dxa" w:w="2880"/>
+          </w:tcPr>
+          <w:p>
+            <w:pPr>
+              <w:spacing w:before="40" w:after="40"/>
+            </w:pPr>
+            <w:r>
+              <w:rPr>
+                <w:rFonts w:ascii="Nirmala UI" w:hAnsi="Nirmala UI" w:eastAsia="Nirmala UI" w:cs="Nirmala UI"/>
+                <w:sz w:val="18"/>
+              </w:rPr>
+              <w:t>Shared Layer Training, 31 Aug</w:t>
+            </w:r>
+          </w:p>
+        </w:tc>
+        <w:tc>
+          <w:tcPr>
+            <w:tcW w:type="dxa" w:w="2880"/>
+          </w:tcPr>
+          <w:p>
+            <w:pPr>
+              <w:spacing w:before="40" w:after="40"/>
+            </w:pPr>
+            <w:r>
+              <w:rPr>
+                <w:rFonts w:ascii="Nirmala UI" w:hAnsi="Nirmala UI" w:eastAsia="Nirmala UI" w:cs="Nirmala UI"/>
+                <w:i/>
+                <w:sz w:val="18"/>
+              </w:rPr>
+              <w:t>Training layers 1, 2 and 4 once, for every client</w:t>
+            </w:r>
+          </w:p>
+        </w:tc>
+      </w:tr>
+      <w:tr>
+        <w:tc>
+          <w:tcPr>
+            <w:tcW w:type="dxa" w:w="2880"/>
+          </w:tcPr>
+          <w:p>
+            <w:pPr>
+              <w:spacing w:before="40" w:after="40"/>
+            </w:pPr>
+            <w:r>
+              <w:rPr>
+                <w:rFonts w:ascii="Nirmala UI" w:hAnsi="Nirmala UI" w:eastAsia="Nirmala UI" w:cs="Nirmala UI"/>
+                <w:sz w:val="18"/>
+              </w:rPr>
+              <w:t>19</w:t>
+            </w:r>
+          </w:p>
+        </w:tc>
+        <w:tc>
+          <w:tcPr>
+            <w:tcW w:type="dxa" w:w="2880"/>
+          </w:tcPr>
+          <w:p>
+            <w:pPr>
+              <w:spacing w:before="40" w:after="40"/>
+            </w:pPr>
+            <w:r>
+              <w:rPr>
+                <w:rFonts w:ascii="Nirmala UI" w:hAnsi="Nirmala UI" w:eastAsia="Nirmala UI" w:cs="Nirmala UI"/>
+                <w:sz w:val="18"/>
+              </w:rPr>
+              <w:t>HDFC Agent Simplified, 3 Sep</w:t>
+            </w:r>
+          </w:p>
+        </w:tc>
+        <w:tc>
+          <w:tcPr>
+            <w:tcW w:type="dxa" w:w="2880"/>
+          </w:tcPr>
+          <w:p>
+            <w:pPr>
+              <w:spacing w:before="40" w:after="40"/>
+            </w:pPr>
+            <w:r>
+              <w:rPr>
+                <w:rFonts w:ascii="Nirmala UI" w:hAnsi="Nirmala UI" w:eastAsia="Nirmala UI" w:cs="Nirmala UI"/>
+                <w:i/>
+                <w:sz w:val="18"/>
+              </w:rPr>
+              <w:t>Cutting the loan agent to a one-minute, three-turn handoff call</w:t>
+            </w:r>
+          </w:p>
+        </w:tc>
+      </w:tr>
+      <w:tr>
+        <w:tc>
+          <w:tcPr>
+            <w:tcW w:type="dxa" w:w="2880"/>
+          </w:tcPr>
+          <w:p>
+            <w:pPr>
+              <w:spacing w:before="40" w:after="40"/>
+            </w:pPr>
+            <w:r>
+              <w:rPr>
+                <w:rFonts w:ascii="Nirmala UI" w:hAnsi="Nirmala UI" w:eastAsia="Nirmala UI" w:cs="Nirmala UI"/>
+                <w:sz w:val="18"/>
+              </w:rPr>
+              <w:t>20</w:t>
+            </w:r>
+          </w:p>
+        </w:tc>
+        <w:tc>
+          <w:tcPr>
+            <w:tcW w:type="dxa" w:w="2880"/>
+          </w:tcPr>
+          <w:p>
+            <w:pPr>
+              <w:spacing w:before="40" w:after="40"/>
+            </w:pPr>
+            <w:r>
+              <w:rPr>
+                <w:rFonts w:ascii="Nirmala UI" w:hAnsi="Nirmala UI" w:eastAsia="Nirmala UI" w:cs="Nirmala UI"/>
+                <w:sz w:val="18"/>
+              </w:rPr>
+              <w:t>Dashboard Cutover to Vaani, 3 Sep</w:t>
+            </w:r>
+          </w:p>
+        </w:tc>
+        <w:tc>
+          <w:tcPr>
+            <w:tcW w:type="dxa" w:w="2880"/>
+          </w:tcPr>
+          <w:p>
+            <w:pPr>
+              <w:spacing w:before="40" w:after="40"/>
+            </w:pPr>
+            <w:r>
+              <w:rPr>
+                <w:rFonts w:ascii="Nirmala UI" w:hAnsi="Nirmala UI" w:eastAsia="Nirmala UI" w:cs="Nirmala UI"/>
+                <w:i/>
+                <w:sz w:val="18"/>
+              </w:rPr>
+              <w:t>Pointing admin.bswealthfinance.com at Vaani, and what the four agents still need published</w:t>
             </w:r>
           </w:p>
         </w:tc>

</xml_diff>